<commit_message>
Pre-register the spatial design; add tested stacked event-study estimator
- expansion/spatial/PRE_ANALYSIS_PLAN.md: three analyses (timing of waterway
  connection, water x coal complementarity, steam chain and macro bridge),
  hypotheses, tests and falsifiers fixed before any spatial data is seen.
- expansion/spatial/DATA_MANIFEST.md: every dataset, where it is, how to get it.
- src/spatial/estimators.py: stacked event study with clean controls, moderator
  split, pre-trend test, national counterfactual; recovers known effects in
  simulation.
- Resubmission manuscript now engages Allen (2023, JEH) on canals and coal prices.

Co-Authored-By: Claude Opus 5.5 <noreply@anthropic.com>
Claude-Session: https://claude.ai/code/session_01Ehom9QszihcGmYFgqu2a2W
</commit_message>
<xml_diff>
--- a/submission/02_journal_of_energy_history/manuscript.docx
+++ b/submission/02_journal_of_energy_history/manuscript.docx
@@ -152,7 +152,7 @@
       </w:r>
     </w:p>
     <w:bookmarkEnd w:id="14"/>
-    <w:bookmarkStart w:id="25" w:name="two-clocks-and-a-precondition"/>
+    <w:bookmarkStart w:id="26" w:name="two-clocks-and-a-precondition"/>
     <w:p>
       <w:pPr>
         <w:pStyle w:val="Heading1"/>
@@ -267,13 +267,25 @@
         <w:t xml:space="preserve"> </w:t>
       </w:r>
       <w:r>
+        <w:t xml:space="preserve">Allen’s coal-price cross-sections for 1695, 1795 and 1842 find strong productivity growth in every mode of coal transport, canals included, but a surprisingly limited effect on where coal was produced and consumed.</w:t>
+      </w:r>
+      <w:r>
+        <w:rPr>
+          <w:rStyle w:val="FootnoteReference"/>
+        </w:rPr>
+        <w:footnoteReference w:id="21"/>
+      </w:r>
+      <w:r>
+        <w:t xml:space="preserve"> </w:t>
+      </w:r>
+      <w:r>
         <w:t xml:space="preserve">The coal trade itself was older: the coastal trade from the Tyne to London was Europe’s largest bulk-freight flow before 1700.</w:t>
       </w:r>
       <w:r>
         <w:rPr>
           <w:rStyle w:val="FootnoteReference"/>
         </w:rPr>
-        <w:footnoteReference w:id="21"/>
+        <w:footnoteReference w:id="22"/>
       </w:r>
       <w:r>
         <w:t xml:space="preserve"> </w:t>
@@ -293,7 +305,7 @@
         <w:rPr>
           <w:rStyle w:val="FootnoteReference"/>
         </w:rPr>
-        <w:footnoteReference w:id="22"/>
+        <w:footnoteReference w:id="23"/>
       </w:r>
       <w:r>
         <w:t xml:space="preserve"> </w:t>
@@ -313,7 +325,7 @@
         <w:rPr>
           <w:rStyle w:val="FootnoteReference"/>
         </w:rPr>
-        <w:footnoteReference w:id="23"/>
+        <w:footnoteReference w:id="24"/>
       </w:r>
       <w:r>
         <w:t xml:space="preserve"> </w:t>
@@ -325,7 +337,7 @@
         <w:rPr>
           <w:rStyle w:val="FootnoteReference"/>
         </w:rPr>
-        <w:footnoteReference w:id="24"/>
+        <w:footnoteReference w:id="25"/>
       </w:r>
       <w:r>
         <w:t xml:space="preserve"> </w:t>
@@ -334,8 +346,8 @@
         <w:t xml:space="preserve">Gradualism in income per head has been read as a verdict against an eighteenth-century take-off. It is a verdict about one variable. The same series show total output and population doubling between 1760 and 1830, and an infrastructure shock in an organic economy should produce exactly that: more mouths fed, not richer ones.</w:t>
       </w:r>
     </w:p>
-    <w:bookmarkEnd w:id="25"/>
-    <w:bookmarkStart w:id="38" w:name="sources-and-methods"/>
+    <w:bookmarkEnd w:id="26"/>
+    <w:bookmarkStart w:id="39" w:name="sources-and-methods"/>
     <w:p>
       <w:pPr>
         <w:pStyle w:val="Heading1"/>
@@ -344,7 +356,7 @@
         <w:t xml:space="preserve">Sources and methods</w:t>
       </w:r>
     </w:p>
-    <w:bookmarkStart w:id="28" w:name="output-population-and-power"/>
+    <w:bookmarkStart w:id="29" w:name="output-population-and-power"/>
     <w:p>
       <w:pPr>
         <w:pStyle w:val="Heading2"/>
@@ -377,7 +389,7 @@
         <w:rPr>
           <w:rStyle w:val="FootnoteReference"/>
         </w:rPr>
-        <w:footnoteReference w:id="26"/>
+        <w:footnoteReference w:id="27"/>
       </w:r>
       <w:r>
         <w:t xml:space="preserve"> </w:t>
@@ -397,7 +409,7 @@
         <w:rPr>
           <w:rStyle w:val="FootnoteReference"/>
         </w:rPr>
-        <w:footnoteReference w:id="27"/>
+        <w:footnoteReference w:id="28"/>
       </w:r>
       <w:r>
         <w:t xml:space="preserve"> </w:t>
@@ -406,8 +418,8 @@
         <w:t xml:space="preserve">Interpolated series between four benchmarks are smooth by construction, so we use them to date crossovers and ratios, not for year-to-year inference.</w:t>
       </w:r>
     </w:p>
-    <w:bookmarkEnd w:id="28"/>
-    <w:bookmarkStart w:id="31" w:name="the-canal-network"/>
+    <w:bookmarkEnd w:id="29"/>
+    <w:bookmarkStart w:id="32" w:name="the-canal-network"/>
     <w:p>
       <w:pPr>
         <w:pStyle w:val="Heading2"/>
@@ -427,7 +439,7 @@
         <w:rPr>
           <w:rStyle w:val="FootnoteReference"/>
         </w:rPr>
-        <w:footnoteReference w:id="29"/>
+        <w:footnoteReference w:id="30"/>
       </w:r>
       <w:r>
         <w:t xml:space="preserve"> </w:t>
@@ -439,7 +451,7 @@
         <w:rPr>
           <w:rStyle w:val="FootnoteReference"/>
         </w:rPr>
-        <w:footnoteReference w:id="30"/>
+        <w:footnoteReference w:id="31"/>
       </w:r>
       <w:r>
         <w:t xml:space="preserve"> </w:t>
@@ -448,8 +460,8 @@
         <w:t xml:space="preserve">All results are reported on the corrected series; on the uncorrected table they are the same in sign and similar in size. The timing is corroborated by an independent primary source. From the digitised text of Priestley’s 1831 survey we recover the year of first authorisation for 152 navigations, including 70 canals authorised in 1760–1829; the authorisation series leads the completion series by roughly a decade and shows the same two waves.</w:t>
       </w:r>
     </w:p>
-    <w:bookmarkEnd w:id="31"/>
-    <w:bookmarkStart w:id="34" w:name="print"/>
+    <w:bookmarkEnd w:id="32"/>
+    <w:bookmarkStart w:id="35" w:name="print"/>
     <w:p>
       <w:pPr>
         <w:pStyle w:val="Heading2"/>
@@ -469,7 +481,7 @@
         <w:rPr>
           <w:rStyle w:val="FootnoteReference"/>
         </w:rPr>
-        <w:footnoteReference w:id="32"/>
+        <w:footnoteReference w:id="33"/>
       </w:r>
       <w:r>
         <w:t xml:space="preserve"> </w:t>
@@ -568,11 +580,11 @@
         <w:rPr>
           <w:rStyle w:val="FootnoteReference"/>
         </w:rPr>
-        <w:footnoteReference w:id="33"/>
-      </w:r>
-    </w:p>
-    <w:bookmarkEnd w:id="34"/>
-    <w:bookmarkStart w:id="37" w:name="methods"/>
+        <w:footnoteReference w:id="34"/>
+      </w:r>
+    </w:p>
+    <w:bookmarkEnd w:id="35"/>
+    <w:bookmarkStart w:id="38" w:name="methods"/>
     <w:p>
       <w:pPr>
         <w:pStyle w:val="Heading2"/>
@@ -592,7 +604,7 @@
         <w:rPr>
           <w:rStyle w:val="FootnoteReference"/>
         </w:rPr>
-        <w:footnoteReference w:id="35"/>
+        <w:footnoteReference w:id="36"/>
       </w:r>
       <w:r>
         <w:t xml:space="preserve"> </w:t>
@@ -604,7 +616,7 @@
         <w:rPr>
           <w:rStyle w:val="FootnoteReference"/>
         </w:rPr>
-        <w:footnoteReference w:id="36"/>
+        <w:footnoteReference w:id="37"/>
       </w:r>
     </w:p>
     <w:p>
@@ -647,9 +659,9 @@
         <w:t xml:space="preserve">circularly shifts the annual series of new mileage within 1700–1830, which preserves its two waves and its lumpiness but moves them in time, rebuilds the stock, and re-estimates; the share of 130 re-timed stocks that fit as well as the real one is a randomisation p-value for the hypothesis that the canals’ timing is irrelevant. All code and data are in the replication package.</w:t>
       </w:r>
     </w:p>
-    <w:bookmarkEnd w:id="37"/>
     <w:bookmarkEnd w:id="38"/>
-    <w:bookmarkStart w:id="44" w:name="results"/>
+    <w:bookmarkEnd w:id="39"/>
+    <w:bookmarkStart w:id="45" w:name="results"/>
     <w:p>
       <w:pPr>
         <w:pStyle w:val="Heading1"/>
@@ -658,7 +670,7 @@
         <w:t xml:space="preserve">Results</w:t>
       </w:r>
     </w:p>
-    <w:bookmarkStart w:id="39" w:name="two-growth-regimes"/>
+    <w:bookmarkStart w:id="40" w:name="two-growth-regimes"/>
     <w:p>
       <w:pPr>
         <w:pStyle w:val="Heading2"/>
@@ -707,8 +719,8 @@
         <w:t xml:space="preserve">The arithmetic of the first regime is simple. Between 1760 and 1815 the growth of total output and of population each rose by about a percentage point a year, and coal output per head doubled. The economy fed half again as many people at the same income, for two generations, without the Malthusian check that had ended earlier expansions. Coal output per head, indexed to 100 in 1700, stood at 202 in 1790 and 246 in 1800. Agriculture’s share fell throughout, and in the sceptical specifications below its response to the canal network is, if anything, negative: labour and capital moved towards the sectors that were growing. The 1818 per-capita break survives a war dummy, which moves it to 1816, and the per-capita trend of 1816–30, at 0.7% a year, is well below the 1.2% of 1830–70.</w:t>
       </w:r>
     </w:p>
-    <w:bookmarkEnd w:id="39"/>
-    <w:bookmarkStart w:id="41" w:name="what-powered-the-first-regime"/>
+    <w:bookmarkEnd w:id="40"/>
+    <w:bookmarkStart w:id="42" w:name="what-powered-the-first-regime"/>
     <w:p>
       <w:pPr>
         <w:pStyle w:val="Heading2"/>
@@ -744,11 +756,11 @@
         <w:rPr>
           <w:rStyle w:val="FootnoteReference"/>
         </w:rPr>
-        <w:footnoteReference w:id="40"/>
-      </w:r>
-    </w:p>
-    <w:bookmarkEnd w:id="41"/>
-    <w:bookmarkStart w:id="42" w:name="Xa160a9884d92c0a9d29a9811ee7849da57e783f"/>
+        <w:footnoteReference w:id="41"/>
+      </w:r>
+    </w:p>
+    <w:bookmarkEnd w:id="42"/>
+    <w:bookmarkStart w:id="43" w:name="Xa160a9884d92c0a9d29a9811ee7849da57e783f"/>
     <w:p>
       <w:pPr>
         <w:pStyle w:val="Heading2"/>
@@ -834,8 +846,8 @@
         <w:t xml:space="preserve">The canal regressions therefore show where the first regime’s acceleration fell, in coal and population and not income per head, and not that the canals’ timing produced it. We draw the sequence from evidence that does not depend on them.</w:t>
       </w:r>
     </w:p>
-    <w:bookmarkEnd w:id="42"/>
-    <w:bookmarkStart w:id="43" w:name="the-order-in-print"/>
+    <w:bookmarkEnd w:id="43"/>
+    <w:bookmarkStart w:id="44" w:name="the-order-in-print"/>
     <w:p>
       <w:pPr>
         <w:pStyle w:val="Heading2"/>
@@ -972,9 +984,9 @@
         <w:t xml:space="preserve">correlates at 0.91 with the cumulative mileage in existence over 1740–1850 and at −0.04 with the mileage opened in the surrounding decade. Print records the level of the built environment, which is written about every year it exists, not the rate of building. The bigram sequence asks about order, not magnitude, and on that it is unambiguous: coal travels by water in print a generation before it is burned in engines.</w:t>
       </w:r>
     </w:p>
-    <w:bookmarkEnd w:id="43"/>
     <w:bookmarkEnd w:id="44"/>
-    <w:bookmarkStart w:id="59" w:name="discussion"/>
+    <w:bookmarkEnd w:id="45"/>
+    <w:bookmarkStart w:id="60" w:name="discussion"/>
     <w:p>
       <w:pPr>
         <w:pStyle w:val="Heading1"/>
@@ -983,7 +995,7 @@
         <w:t xml:space="preserve">Discussion</w:t>
       </w:r>
     </w:p>
-    <w:bookmarkStart w:id="46" w:name="floated-before-fired"/>
+    <w:bookmarkStart w:id="47" w:name="floated-before-fired"/>
     <w:p>
       <w:pPr>
         <w:pStyle w:val="Heading2"/>
@@ -1005,17 +1017,17 @@
         <w:pStyle w:val="BodyText"/>
       </w:pPr>
       <w:r>
-        <w:t xml:space="preserve">This is Tvedt’s sequence, and it is visible in the British record without a causal estimate of the canals’ effect. Steam could not have carried the first regime, because it was too small; the regime ran on coal, because coal output per head doubled; the coal had to reach users away from the coast and the pit, and before railways the only cheap way to move a bulk good inland was on water; and the language of the period registered coal on the water before coal in the engine. What the national series cannot establish is that the canals’ own timing, rather than the general acceleration they were part of, moved coal. Canals were built where demand was growing, and a sixty-year stock is too close to a trend to separate the two. The regional evidence of Turnbull and the market-access estimates of Alvarez-Palau and co-authors supply the cross-sectional variation that could; a county panel of coal prices and output, with terrain as the source of variation in canal access, is the natural next step.</w:t>
+        <w:t xml:space="preserve">This is Tvedt’s sequence, and it is visible in the British record without a causal estimate of the canals’ effect. Steam could not have carried the first regime, because it was too small; the regime ran on coal, because coal output per head doubled; the coal had to reach users away from the coast and the pit, and before railways the only cheap way to move a bulk good inland was on water; and the language of the period registered coal on the water before coal in the engine. What the national series cannot establish is that the canals’ own timing, rather than the general acceleration they were part of, moved coal. Canals were built where demand was growing, and a sixty-year stock is too close to a trend to separate the two. The regional evidence of Turnbull and the market-access estimates of Alvarez-Palau and co-authors supply the cross-sectional variation that could; a panel of parishes connected to the waterway network in different years, with terrain as the source of variation in connection and coal prices as the mechanism, is the natural next step, and it would also say whether Allen’s finding of limited geographic effects holds for the timing of connection.</w:t>
       </w:r>
       <w:r>
         <w:rPr>
           <w:rStyle w:val="FootnoteReference"/>
         </w:rPr>
-        <w:footnoteReference w:id="45"/>
-      </w:r>
-    </w:p>
-    <w:bookmarkEnd w:id="46"/>
-    <w:bookmarkStart w:id="50" w:name="X96c02b8b3b092a6a4c47b81c924526fd4bad9a4"/>
+        <w:footnoteReference w:id="46"/>
+      </w:r>
+    </w:p>
+    <w:bookmarkEnd w:id="47"/>
+    <w:bookmarkStart w:id="51" w:name="X96c02b8b3b092a6a4c47b81c924526fd4bad9a4"/>
     <w:p>
       <w:pPr>
         <w:pStyle w:val="Heading2"/>
@@ -1035,7 +1047,7 @@
         <w:rPr>
           <w:rStyle w:val="FootnoteReference"/>
         </w:rPr>
-        <w:footnoteReference w:id="47"/>
+        <w:footnoteReference w:id="48"/>
       </w:r>
       <w:r>
         <w:t xml:space="preserve"> </w:t>
@@ -1055,7 +1067,7 @@
         <w:rPr>
           <w:rStyle w:val="FootnoteReference"/>
         </w:rPr>
-        <w:footnoteReference w:id="48"/>
+        <w:footnoteReference w:id="49"/>
       </w:r>
       <w:r>
         <w:t xml:space="preserve"> </w:t>
@@ -1067,7 +1079,7 @@
         <w:rPr>
           <w:rStyle w:val="FootnoteReference"/>
         </w:rPr>
-        <w:footnoteReference w:id="49"/>
+        <w:footnoteReference w:id="50"/>
       </w:r>
       <w:r>
         <w:t xml:space="preserve"> </w:t>
@@ -1076,8 +1088,8 @@
         <w:t xml:space="preserve">Before steam could be chosen over water for its portability, water had built the markets that made a portable prime mover worth having. Steam had to improve on a prime mover that was, in 1800, three times its size.</w:t>
       </w:r>
     </w:p>
-    <w:bookmarkEnd w:id="50"/>
-    <w:bookmarkStart w:id="51" w:name="a-check-for-infrastructure-preconditions"/>
+    <w:bookmarkEnd w:id="51"/>
+    <w:bookmarkStart w:id="52" w:name="a-check-for-infrastructure-preconditions"/>
     <w:p>
       <w:pPr>
         <w:pStyle w:val="Heading2"/>
@@ -1094,8 +1106,8 @@
         <w:t xml:space="preserve">The British case carries a lesson beyond Britain. Energy history is full of claims that some slowly accumulated infrastructure was the precondition of a transition: canals for coal, railways for the coalfields of the Ruhr and Pennsylvania, transmission grids for electrification, pipelines for natural gas. When such claims are tested quantitatively, they are usually tested as here, by relating a national stock to national output. The exercise in Figure 3 shows how far that can go, and it can be repeated in a few lines for any stock. First, regress the stock on a quadratic trend: when the trend explains more than about 95% of its variance, as it does for both British canal series, conventional Newey–West tests on a century of annual data reject a true null several times too often, and a threshold nearer 0.003 than 0.05 is needed. Second, shift the stock forwards and backwards: if canals, lines or pipes not yet built fit the outcome as well as those already in use, the stock is standing in for the trend. Third, re-time the stock by circularly shifting its annual increments and ask how often a re-timed stock fits as well. Where the stock was built in sharp, dated episodes, these checks leave room for a result; where, like the British canal network, it grew for sixty years in overlapping waves, they will usually say that national series can locate the acceleration but not attribute it. That is still worth knowing, and it points the analysis towards the regional variation where attribution is possible.</w:t>
       </w:r>
     </w:p>
-    <w:bookmarkEnd w:id="51"/>
-    <w:bookmarkStart w:id="57" w:name="the-comparative-question-briefly"/>
+    <w:bookmarkEnd w:id="52"/>
+    <w:bookmarkStart w:id="58" w:name="the-comparative-question-briefly"/>
     <w:p>
       <w:pPr>
         <w:pStyle w:val="Heading2"/>
@@ -1115,7 +1127,7 @@
         <w:rPr>
           <w:rStyle w:val="FootnoteReference"/>
         </w:rPr>
-        <w:footnoteReference w:id="52"/>
+        <w:footnoteReference w:id="53"/>
       </w:r>
       <w:r>
         <w:t xml:space="preserve"> </w:t>
@@ -1127,7 +1139,7 @@
         <w:rPr>
           <w:rStyle w:val="FootnoteReference"/>
         </w:rPr>
-        <w:footnoteReference w:id="53"/>
+        <w:footnoteReference w:id="54"/>
       </w:r>
       <w:r>
         <w:t xml:space="preserve"> </w:t>
@@ -1139,7 +1151,7 @@
         <w:rPr>
           <w:rStyle w:val="FootnoteReference"/>
         </w:rPr>
-        <w:footnoteReference w:id="54"/>
+        <w:footnoteReference w:id="55"/>
       </w:r>
       <w:r>
         <w:t xml:space="preserve"> </w:t>
@@ -1151,7 +1163,7 @@
         <w:rPr>
           <w:rStyle w:val="FootnoteReference"/>
         </w:rPr>
-        <w:footnoteReference w:id="55"/>
+        <w:footnoteReference w:id="56"/>
       </w:r>
       <w:r>
         <w:t xml:space="preserve"> </w:t>
@@ -1163,11 +1175,11 @@
         <w:rPr>
           <w:rStyle w:val="FootnoteReference"/>
         </w:rPr>
-        <w:footnoteReference w:id="56"/>
-      </w:r>
-    </w:p>
-    <w:bookmarkEnd w:id="57"/>
-    <w:bookmarkStart w:id="58" w:name="limitations"/>
+        <w:footnoteReference w:id="57"/>
+      </w:r>
+    </w:p>
+    <w:bookmarkEnd w:id="58"/>
+    <w:bookmarkStart w:id="59" w:name="limitations"/>
     <w:p>
       <w:pPr>
         <w:pStyle w:val="Heading2"/>
@@ -1184,9 +1196,9 @@
         <w:t xml:space="preserve">The canal series is provisional. It rests on a corrected reference table checked against the Cambridge Group’s network totals and corroborated by Priestley’s authorisations, only 152 of which could be recovered from the digitised text; it excludes Scottish canals and dates staged openings late. A definitive series would come from the Cambridge Group’s sectional opening dates. The power series exists at four benchmarks, so the ordering of steam relative to coal is established across benchmarks, not year by year, and water horsepower is collinear with the canal stock, so the transport and power halves of Tvedt’s thesis cannot be separated with these data. The design has limited power: at the size-corrected threshold it would detect a direct effect of canals on income per head of about 40% by 1830 with 80% probability, so the null on income per head rules out a large rival effect, not a modest one. The print record over-represents technical publishing and is thin before 1770. Each of these is a reason to read the magnitudes cautiously. The chronology rests on several independent sources — break dates in independently constructed output series, the power benchmarks and the printed record — and none of these limitations affects all of them at once.</w:t>
       </w:r>
     </w:p>
-    <w:bookmarkEnd w:id="58"/>
     <w:bookmarkEnd w:id="59"/>
-    <w:bookmarkStart w:id="60" w:name="conclusion"/>
+    <w:bookmarkEnd w:id="60"/>
+    <w:bookmarkStart w:id="61" w:name="conclusion"/>
     <w:p>
       <w:pPr>
         <w:pStyle w:val="Heading1"/>
@@ -1219,8 +1231,8 @@
         <w:t xml:space="preserve">The sequence does not depend on that test. It rests on when the economy accelerated, what powered it when it did, and what its printed record talked about. On all three the answer is the same. The fossil economy was floated before it was fired.</w:t>
       </w:r>
     </w:p>
-    <w:bookmarkEnd w:id="60"/>
-    <w:bookmarkStart w:id="61" w:name="data-availability-statement"/>
+    <w:bookmarkEnd w:id="61"/>
+    <w:bookmarkStart w:id="62" w:name="data-availability-statement"/>
     <w:p>
       <w:pPr>
         <w:pStyle w:val="Heading1"/>
@@ -1250,8 +1262,8 @@
         <w:t xml:space="preserve">, which reproduces Broadberry et al. (2015); cross-country benchmarks are from the Maddison Project Database 2023; horsepower benchmarks are from Kanefsky (1979) as reported in Crafts (2004); canal completion years and lengths, and parliamentary authorisation years parsed from Priestley (1831), are included with their construction scripts; word frequencies are from the Google Books Ngram Corpus, British English 2019 edition.</w:t>
       </w:r>
     </w:p>
-    <w:bookmarkEnd w:id="61"/>
-    <w:bookmarkStart w:id="62" w:name="tables"/>
+    <w:bookmarkEnd w:id="62"/>
+    <w:bookmarkStart w:id="63" w:name="tables"/>
     <w:p>
       <w:pPr>
         <w:pStyle w:val="Heading1"/>
@@ -3533,8 +3545,8 @@
         <w:t xml:space="preserve">.</w:t>
       </w:r>
     </w:p>
-    <w:bookmarkEnd w:id="62"/>
-    <w:bookmarkStart w:id="75" w:name="figures"/>
+    <w:bookmarkEnd w:id="63"/>
+    <w:bookmarkStart w:id="76" w:name="figures"/>
     <w:p>
       <w:pPr>
         <w:pStyle w:val="Heading1"/>
@@ -3570,18 +3582,18 @@
           <wp:inline>
             <wp:extent cx="5334000" cy="2240279"/>
             <wp:effectExtent b="0" l="0" r="0" t="0"/>
-            <wp:docPr descr="" title="" id="64" name="Picture"/>
+            <wp:docPr descr="" title="" id="65" name="Picture"/>
             <a:graphic>
               <a:graphicData uri="http://schemas.openxmlformats.org/drawingml/2006/picture">
                 <pic:pic>
                   <pic:nvPicPr>
-                    <pic:cNvPr descr="fig1_two_regimes.png" id="65" name="Picture"/>
+                    <pic:cNvPr descr="fig1_two_regimes.png" id="66" name="Picture"/>
                     <pic:cNvPicPr>
                       <a:picLocks noChangeArrowheads="1" noChangeAspect="1"/>
                     </pic:cNvPicPr>
                   </pic:nvPicPr>
                   <pic:blipFill>
-                    <a:blip r:embed="rId63"/>
+                    <a:blip r:embed="rId64"/>
                     <a:stretch>
                       <a:fillRect/>
                     </a:stretch>
@@ -3635,18 +3647,18 @@
           <wp:inline>
             <wp:extent cx="5334000" cy="1842654"/>
             <wp:effectExtent b="0" l="0" r="0" t="0"/>
-            <wp:docPr descr="" title="" id="67" name="Picture"/>
+            <wp:docPr descr="" title="" id="68" name="Picture"/>
             <a:graphic>
               <a:graphicData uri="http://schemas.openxmlformats.org/drawingml/2006/picture">
                 <pic:pic>
                   <pic:nvPicPr>
-                    <pic:cNvPr descr="fig2_canal_dose.png" id="68" name="Picture"/>
+                    <pic:cNvPr descr="fig2_canal_dose.png" id="69" name="Picture"/>
                     <pic:cNvPicPr>
                       <a:picLocks noChangeArrowheads="1" noChangeAspect="1"/>
                     </pic:cNvPicPr>
                   </pic:nvPicPr>
                   <pic:blipFill>
-                    <a:blip r:embed="rId66"/>
+                    <a:blip r:embed="rId67"/>
                     <a:stretch>
                       <a:fillRect/>
                     </a:stretch>
@@ -3700,18 +3712,18 @@
           <wp:inline>
             <wp:extent cx="5334000" cy="2003607"/>
             <wp:effectExtent b="0" l="0" r="0" t="0"/>
-            <wp:docPr descr="" title="" id="70" name="Picture"/>
+            <wp:docPr descr="" title="" id="71" name="Picture"/>
             <a:graphic>
               <a:graphicData uri="http://schemas.openxmlformats.org/drawingml/2006/picture">
                 <pic:pic>
                   <pic:nvPicPr>
-                    <pic:cNvPr descr="fig8_falsification.png" id="71" name="Picture"/>
+                    <pic:cNvPr descr="fig8_falsification.png" id="72" name="Picture"/>
                     <pic:cNvPicPr>
                       <a:picLocks noChangeArrowheads="1" noChangeAspect="1"/>
                     </pic:cNvPicPr>
                   </pic:nvPicPr>
                   <pic:blipFill>
-                    <a:blip r:embed="rId69"/>
+                    <a:blip r:embed="rId70"/>
                     <a:stretch>
                       <a:fillRect/>
                     </a:stretch>
@@ -3819,18 +3831,18 @@
           <wp:inline>
             <wp:extent cx="5334000" cy="2133600"/>
             <wp:effectExtent b="0" l="0" r="0" t="0"/>
-            <wp:docPr descr="" title="" id="73" name="Picture"/>
+            <wp:docPr descr="" title="" id="74" name="Picture"/>
             <a:graphic>
               <a:graphicData uri="http://schemas.openxmlformats.org/drawingml/2006/picture">
                 <pic:pic>
                   <pic:nvPicPr>
-                    <pic:cNvPr descr="fig4_semantic_sequence.png" id="74" name="Picture"/>
+                    <pic:cNvPr descr="fig4_semantic_sequence.png" id="75" name="Picture"/>
                     <pic:cNvPicPr>
                       <a:picLocks noChangeArrowheads="1" noChangeAspect="1"/>
                     </pic:cNvPicPr>
                   </pic:nvPicPr>
                   <pic:blipFill>
-                    <a:blip r:embed="rId72"/>
+                    <a:blip r:embed="rId73"/>
                     <a:stretch>
                       <a:fillRect/>
                     </a:stretch>
@@ -3857,7 +3869,7 @@
         </w:drawing>
       </w:r>
     </w:p>
-    <w:bookmarkEnd w:id="75"/>
+    <w:bookmarkEnd w:id="76"/>
     <w:sectPr>
       <w:footnotePr>
         <w:numRestart w:val="eachSect"/>
@@ -4396,7 +4408,16 @@
         <w:t xml:space="preserve"> </w:t>
       </w:r>
       <w:r>
-        <w:t xml:space="preserve">John Hatcher,</w:t>
+        <w:t xml:space="preserve">Robert C. Allen,</w:t>
+      </w:r>
+      <w:r>
+        <w:t xml:space="preserve"> </w:t>
+      </w:r>
+      <w:r>
+        <w:t xml:space="preserve">‘The Transportation Revolution and the English Coal Industry, 1695–1842: A Geographical Approach’</w:t>
+      </w:r>
+      <w:r>
+        <w:t xml:space="preserve">,</w:t>
       </w:r>
       <w:r>
         <w:t xml:space="preserve"> </w:t>
@@ -4406,13 +4427,32 @@
           <w:i/>
           <w:iCs/>
         </w:rPr>
-        <w:t xml:space="preserve">The History of the British Coal Industry, Volume 1: Before 1700</w:t>
-      </w:r>
-      <w:r>
-        <w:t xml:space="preserve"> </w:t>
-      </w:r>
-      <w:r>
-        <w:t xml:space="preserve">(Clarendon Press, 1993); Michael W. Flinn,</w:t>
+        <w:t xml:space="preserve">Journal of Economic History</w:t>
+      </w:r>
+      <w:r>
+        <w:t xml:space="preserve"> </w:t>
+      </w:r>
+      <w:r>
+        <w:t xml:space="preserve">83, no. 4 (2023): 1175–220.</w:t>
+      </w:r>
+    </w:p>
+  </w:footnote>
+  <w:footnote w:id="22">
+    <w:p>
+      <w:pPr>
+        <w:pStyle w:val="FootnoteText"/>
+      </w:pPr>
+      <w:r>
+        <w:rPr>
+          <w:rStyle w:val="FootnoteReference"/>
+        </w:rPr>
+        <w:footnoteRef/>
+      </w:r>
+      <w:r>
+        <w:t xml:space="preserve"> </w:t>
+      </w:r>
+      <w:r>
+        <w:t xml:space="preserve">John Hatcher,</w:t>
       </w:r>
       <w:r>
         <w:t xml:space="preserve"> </w:t>
@@ -4422,6 +4462,22 @@
           <w:i/>
           <w:iCs/>
         </w:rPr>
+        <w:t xml:space="preserve">The History of the British Coal Industry, Volume 1: Before 1700</w:t>
+      </w:r>
+      <w:r>
+        <w:t xml:space="preserve"> </w:t>
+      </w:r>
+      <w:r>
+        <w:t xml:space="preserve">(Clarendon Press, 1993); Michael W. Flinn,</w:t>
+      </w:r>
+      <w:r>
+        <w:t xml:space="preserve"> </w:t>
+      </w:r>
+      <w:r>
+        <w:rPr>
+          <w:i/>
+          <w:iCs/>
+        </w:rPr>
         <w:t xml:space="preserve">The History of the British Coal Industry, Volume 2: 1700–1830</w:t>
       </w:r>
       <w:r>
@@ -4429,34 +4485,6 @@
       </w:r>
       <w:r>
         <w:t xml:space="preserve">(Clarendon Press, 1984).</w:t>
-      </w:r>
-    </w:p>
-  </w:footnote>
-  <w:footnote w:id="22">
-    <w:p>
-      <w:pPr>
-        <w:pStyle w:val="FootnoteText"/>
-      </w:pPr>
-      <w:r>
-        <w:rPr>
-          <w:rStyle w:val="FootnoteReference"/>
-        </w:rPr>
-        <w:footnoteRef/>
-      </w:r>
-      <w:r>
-        <w:t xml:space="preserve"> </w:t>
-      </w:r>
-      <w:r>
-        <w:t xml:space="preserve">Tvedt,</w:t>
-      </w:r>
-      <w:r>
-        <w:t xml:space="preserve"> </w:t>
-      </w:r>
-      <w:r>
-        <w:t xml:space="preserve">‘Why England’</w:t>
-      </w:r>
-      <w:r>
-        <w:t xml:space="preserve">.</w:t>
       </w:r>
     </w:p>
   </w:footnote>
@@ -4475,6 +4503,34 @@
         <w:t xml:space="preserve"> </w:t>
       </w:r>
       <w:r>
+        <w:t xml:space="preserve">Tvedt,</w:t>
+      </w:r>
+      <w:r>
+        <w:t xml:space="preserve"> </w:t>
+      </w:r>
+      <w:r>
+        <w:t xml:space="preserve">‘Why England’</w:t>
+      </w:r>
+      <w:r>
+        <w:t xml:space="preserve">.</w:t>
+      </w:r>
+    </w:p>
+  </w:footnote>
+  <w:footnote w:id="24">
+    <w:p>
+      <w:pPr>
+        <w:pStyle w:val="FootnoteText"/>
+      </w:pPr>
+      <w:r>
+        <w:rPr>
+          <w:rStyle w:val="FootnoteReference"/>
+        </w:rPr>
+        <w:footnoteRef/>
+      </w:r>
+      <w:r>
+        <w:t xml:space="preserve"> </w:t>
+      </w:r>
+      <w:r>
         <w:t xml:space="preserve">Nicholas F. R. Crafts,</w:t>
       </w:r>
       <w:r>
@@ -4533,7 +4589,7 @@
       </w:r>
     </w:p>
   </w:footnote>
-  <w:footnote w:id="24">
+  <w:footnote w:id="25">
     <w:p>
       <w:pPr>
         <w:pStyle w:val="FootnoteText"/>
@@ -4561,7 +4617,7 @@
       </w:r>
     </w:p>
   </w:footnote>
-  <w:footnote w:id="26">
+  <w:footnote w:id="27">
     <w:p>
       <w:pPr>
         <w:pStyle w:val="FootnoteText"/>
@@ -4606,7 +4662,7 @@
       </w:r>
     </w:p>
   </w:footnote>
-  <w:footnote w:id="27">
+  <w:footnote w:id="28">
     <w:p>
       <w:pPr>
         <w:pStyle w:val="FootnoteText"/>
@@ -4643,7 +4699,7 @@
       </w:r>
     </w:p>
   </w:footnote>
-  <w:footnote w:id="29">
+  <w:footnote w:id="30">
     <w:p>
       <w:pPr>
         <w:pStyle w:val="FootnoteText"/>
@@ -4694,7 +4750,7 @@
       </w:r>
     </w:p>
   </w:footnote>
-  <w:footnote w:id="30">
+  <w:footnote w:id="31">
     <w:p>
       <w:pPr>
         <w:pStyle w:val="FootnoteText"/>
@@ -4722,7 +4778,7 @@
       </w:r>
     </w:p>
   </w:footnote>
-  <w:footnote w:id="32">
+  <w:footnote w:id="33">
     <w:p>
       <w:pPr>
         <w:pStyle w:val="FootnoteText"/>
@@ -4766,7 +4822,7 @@
       </w:r>
     </w:p>
   </w:footnote>
-  <w:footnote w:id="33">
+  <w:footnote w:id="34">
     <w:p>
       <w:pPr>
         <w:pStyle w:val="FootnoteText"/>
@@ -4810,7 +4866,7 @@
       </w:r>
     </w:p>
   </w:footnote>
-  <w:footnote w:id="35">
+  <w:footnote w:id="36">
     <w:p>
       <w:pPr>
         <w:pStyle w:val="FootnoteText"/>
@@ -4879,7 +4935,7 @@
       </w:r>
     </w:p>
   </w:footnote>
-  <w:footnote w:id="36">
+  <w:footnote w:id="37">
     <w:p>
       <w:pPr>
         <w:pStyle w:val="FootnoteText"/>
@@ -4948,7 +5004,7 @@
       </w:r>
     </w:p>
   </w:footnote>
-  <w:footnote w:id="40">
+  <w:footnote w:id="41">
     <w:p>
       <w:pPr>
         <w:pStyle w:val="FootnoteText"/>
@@ -4976,7 +5032,7 @@
       </w:r>
     </w:p>
   </w:footnote>
-  <w:footnote w:id="45">
+  <w:footnote w:id="46">
     <w:p>
       <w:pPr>
         <w:pStyle w:val="FootnoteText"/>
@@ -5009,11 +5065,20 @@
         <w:t xml:space="preserve">‘Transport and Urban Growth’</w:t>
       </w:r>
       <w:r>
+        <w:t xml:space="preserve">; Allen,</w:t>
+      </w:r>
+      <w:r>
+        <w:t xml:space="preserve"> </w:t>
+      </w:r>
+      <w:r>
+        <w:t xml:space="preserve">‘Transportation Revolution’</w:t>
+      </w:r>
+      <w:r>
         <w:t xml:space="preserve">.</w:t>
       </w:r>
     </w:p>
   </w:footnote>
-  <w:footnote w:id="47">
+  <w:footnote w:id="48">
     <w:p>
       <w:pPr>
         <w:pStyle w:val="FootnoteText"/>
@@ -5061,7 +5126,7 @@
       </w:r>
     </w:p>
   </w:footnote>
-  <w:footnote w:id="48">
+  <w:footnote w:id="49">
     <w:p>
       <w:pPr>
         <w:pStyle w:val="FootnoteText"/>
@@ -5093,7 +5158,7 @@
       </w:r>
     </w:p>
   </w:footnote>
-  <w:footnote w:id="49">
+  <w:footnote w:id="50">
     <w:p>
       <w:pPr>
         <w:pStyle w:val="FootnoteText"/>
@@ -5141,7 +5206,7 @@
       </w:r>
     </w:p>
   </w:footnote>
-  <w:footnote w:id="52">
+  <w:footnote w:id="53">
     <w:p>
       <w:pPr>
         <w:pStyle w:val="FootnoteText"/>
@@ -5185,7 +5250,7 @@
       </w:r>
     </w:p>
   </w:footnote>
-  <w:footnote w:id="53">
+  <w:footnote w:id="54">
     <w:p>
       <w:pPr>
         <w:pStyle w:val="FootnoteText"/>
@@ -5261,7 +5326,7 @@
       </w:r>
     </w:p>
   </w:footnote>
-  <w:footnote w:id="54">
+  <w:footnote w:id="55">
     <w:p>
       <w:pPr>
         <w:pStyle w:val="FootnoteText"/>
@@ -5296,7 +5361,7 @@
       </w:r>
     </w:p>
   </w:footnote>
-  <w:footnote w:id="55">
+  <w:footnote w:id="56">
     <w:p>
       <w:pPr>
         <w:pStyle w:val="FootnoteText"/>
@@ -5369,7 +5434,7 @@
       </w:r>
     </w:p>
   </w:footnote>
-  <w:footnote w:id="56">
+  <w:footnote w:id="57">
     <w:p>
       <w:pPr>
         <w:pStyle w:val="FootnoteText"/>

</xml_diff>